<commit_message>
Fluent: add confirmed $25K+/mo Google Ads spend (Level, Fetch & Funnel) to profile, resume, and application answers
Co-Authored-By: Claude Opus 5.5 <noreply@anthropic.com>
Claude-Session: https://claude.ai/code/session_013J244MsEuZNucsaEcbyk8A
</commit_message>
<xml_diff>
--- a/applications/fluent-account-manager-advertiser-success/Rotenberg Resume - Fluent - Account Manager Advertiser Success.docx
+++ b/applications/fluent-account-manager-advertiser-success/Rotenberg Resume - Fluent - Account Manager Advertiser Success.docx
@@ -399,7 +399,7 @@
           <w:i w:val="0"/>
           <w:color w:val="1A1A1A"/>
         </w:rPr>
-        <w:t>Advised clients on ad-spend budget planning and allocation across paid campaigns.</w:t>
+        <w:t>Advised incoming clients on media spend, including Google Ads budgets of $25K+/month, and allocated part of that budget to hyper-targeted LinkedIn Ads campaigns built around a defined ICP.</w:t>
       </w:r>
     </w:p>
     <w:p>
@@ -700,6 +700,30 @@
           <w:color w:val="1A1A1A"/>
         </w:rPr>
         <w:t>Ran client accounts end to end at a performance marketing agency, covering campaign execution, performance reporting, and cross-team communication.</w:t>
+      </w:r>
+    </w:p>
+    <w:p>
+      <w:pPr>
+        <w:spacing w:after="30"/>
+        <w:ind w:left="259" w:hanging="259"/>
+      </w:pPr>
+      <w:r>
+        <w:rPr>
+          <w:rFonts w:ascii="Calibri" w:hAnsi="Calibri"/>
+          <w:b w:val="0"/>
+          <w:i w:val="0"/>
+          <w:color w:val="163A5F"/>
+        </w:rPr>
+        <w:t xml:space="preserve">•  </w:t>
+      </w:r>
+      <w:r>
+        <w:rPr>
+          <w:rFonts w:ascii="Calibri" w:hAnsi="Calibri"/>
+          <w:b w:val="0"/>
+          <w:i w:val="0"/>
+          <w:color w:val="1A1A1A"/>
+        </w:rPr>
+        <w:t>Advised incoming clients on media spend and budget allocation, with Google Ads budgets running $25K+/month.</w:t>
       </w:r>
     </w:p>
     <w:p>

</xml_diff>